<commit_message>
docs: update project documentation for HH_GOA_2026
</commit_message>
<xml_diff>
--- a/HH_GOA_2026_Documentation.docx
+++ b/HH_GOA_2026_Documentation.docx
@@ -19,9 +19,9 @@
           <w:rFonts w:ascii="Arial" w:hAnsi="Arial"/>
           <w:i/>
           <w:color w:val="148048"/>
-          <w:sz w:val="28"/>
+          <w:sz w:val="26"/>
         </w:rPr>
-        <w:t>Complete Features &amp; Component Architecture Documentation</w:t>
+        <w:t>Complete Features, Design System &amp; Component Architecture Documentation</w:t>
       </w:r>
     </w:p>
     <w:p/>
@@ -52,6 +52,11 @@
         <w:t>2. Design System &amp; Theme Tokens (Neo-Brutalist Tropical Cyberpunk)</w:t>
       </w:r>
     </w:p>
+    <w:p>
+      <w:r>
+        <w:t>The application strictly enforces the official HH GOA 2026 design aesthetic:</w:t>
+      </w:r>
+    </w:p>
     <w:tbl>
       <w:tblPr>
         <w:tblW w:type="auto" w:w="0"/>
@@ -76,6 +81,7 @@
                 <w:rFonts w:ascii="Arial" w:hAnsi="Arial"/>
                 <w:b/>
                 <w:color w:val="FFFFFF"/>
+                <w:sz w:val="19"/>
               </w:rPr>
               <w:t>Token Name</w:t>
             </w:r>
@@ -92,6 +98,7 @@
                 <w:rFonts w:ascii="Arial" w:hAnsi="Arial"/>
                 <w:b/>
                 <w:color w:val="FFFFFF"/>
+                <w:sz w:val="19"/>
               </w:rPr>
               <w:t>Hex Color</w:t>
             </w:r>
@@ -108,6 +115,7 @@
                 <w:rFonts w:ascii="Arial" w:hAnsi="Arial"/>
                 <w:b/>
                 <w:color w:val="FFFFFF"/>
+                <w:sz w:val="19"/>
               </w:rPr>
               <w:t>Description / Usage</w:t>
             </w:r>
@@ -124,6 +132,7 @@
             <w:r>
               <w:rPr>
                 <w:rFonts w:ascii="Arial" w:hAnsi="Arial"/>
+                <w:sz w:val="19"/>
               </w:rPr>
               <w:t>Primary Background</w:t>
             </w:r>
@@ -139,6 +148,7 @@
               <w:rPr>
                 <w:rFonts w:ascii="Consolas" w:hAnsi="Consolas"/>
                 <w:b/>
+                <w:sz w:val="19"/>
               </w:rPr>
               <w:t>#0A5C36</w:t>
             </w:r>
@@ -153,6 +163,7 @@
             <w:r>
               <w:rPr>
                 <w:rFonts w:ascii="Arial" w:hAnsi="Arial"/>
+                <w:sz w:val="19"/>
               </w:rPr>
               <w:t>Deep Emerald Palm Green main canvas &amp; background</w:t>
             </w:r>
@@ -168,6 +179,7 @@
             <w:r>
               <w:rPr>
                 <w:rFonts w:ascii="Arial" w:hAnsi="Arial"/>
+                <w:sz w:val="19"/>
               </w:rPr>
               <w:t>Primary Accent</w:t>
             </w:r>
@@ -182,6 +194,7 @@
               <w:rPr>
                 <w:rFonts w:ascii="Consolas" w:hAnsi="Consolas"/>
                 <w:b/>
+                <w:sz w:val="19"/>
               </w:rPr>
               <w:t>#FFE500</w:t>
             </w:r>
@@ -195,6 +208,7 @@
             <w:r>
               <w:rPr>
                 <w:rFonts w:ascii="Arial" w:hAnsi="Arial"/>
+                <w:sz w:val="19"/>
               </w:rPr>
               <w:t>Electric Sun Yellow display text, buttons &amp; borders</w:t>
             </w:r>
@@ -211,6 +225,7 @@
             <w:r>
               <w:rPr>
                 <w:rFonts w:ascii="Arial" w:hAnsi="Arial"/>
+                <w:sz w:val="19"/>
               </w:rPr>
               <w:t>Cultural Highlight</w:t>
             </w:r>
@@ -226,6 +241,7 @@
               <w:rPr>
                 <w:rFonts w:ascii="Consolas" w:hAnsi="Consolas"/>
                 <w:b/>
+                <w:sz w:val="19"/>
               </w:rPr>
               <w:t>#FF007A</w:t>
             </w:r>
@@ -240,6 +256,7 @@
             <w:r>
               <w:rPr>
                 <w:rFonts w:ascii="Arial" w:hAnsi="Arial"/>
+                <w:sz w:val="19"/>
               </w:rPr>
               <w:t>Hot Magenta Pink badge accents, glows &amp; badges</w:t>
             </w:r>
@@ -255,6 +272,7 @@
             <w:r>
               <w:rPr>
                 <w:rFonts w:ascii="Arial" w:hAnsi="Arial"/>
+                <w:sz w:val="19"/>
               </w:rPr>
               <w:t>High-Contrast Text</w:t>
             </w:r>
@@ -269,6 +287,7 @@
               <w:rPr>
                 <w:rFonts w:ascii="Consolas" w:hAnsi="Consolas"/>
                 <w:b/>
+                <w:sz w:val="19"/>
               </w:rPr>
               <w:t>#FFFFFF</w:t>
             </w:r>
@@ -282,6 +301,7 @@
             <w:r>
               <w:rPr>
                 <w:rFonts w:ascii="Arial" w:hAnsi="Arial"/>
+                <w:sz w:val="19"/>
               </w:rPr>
               <w:t>Pure White body text &amp; controls</w:t>
             </w:r>
@@ -298,6 +318,7 @@
             <w:r>
               <w:rPr>
                 <w:rFonts w:ascii="Arial" w:hAnsi="Arial"/>
+                <w:sz w:val="19"/>
               </w:rPr>
               <w:t>Tech Metadata</w:t>
             </w:r>
@@ -313,6 +334,7 @@
               <w:rPr>
                 <w:rFonts w:ascii="Consolas" w:hAnsi="Consolas"/>
                 <w:b/>
+                <w:sz w:val="19"/>
               </w:rPr>
               <w:t>#E5C200</w:t>
             </w:r>
@@ -327,8 +349,9 @@
             <w:r>
               <w:rPr>
                 <w:rFonts w:ascii="Arial" w:hAnsi="Arial"/>
+                <w:sz w:val="19"/>
               </w:rPr>
-              <w:t>Golden Sunshine Yellow monospace dates &amp; tags</w:t>
+              <w:t>Golden Sunshine Yellow monospace dates, tags &amp; bullet stars (✦)</w:t>
             </w:r>
           </w:p>
         </w:tc>
@@ -342,6 +365,7 @@
             <w:r>
               <w:rPr>
                 <w:rFonts w:ascii="Arial" w:hAnsi="Arial"/>
+                <w:sz w:val="19"/>
               </w:rPr>
               <w:t>Dividers &amp; Outlines</w:t>
             </w:r>
@@ -356,6 +380,7 @@
               <w:rPr>
                 <w:rFonts w:ascii="Consolas" w:hAnsi="Consolas"/>
                 <w:b/>
+                <w:sz w:val="19"/>
               </w:rPr>
               <w:t>#148048</w:t>
             </w:r>
@@ -369,8 +394,9 @@
             <w:r>
               <w:rPr>
                 <w:rFonts w:ascii="Arial" w:hAnsi="Arial"/>
+                <w:sz w:val="19"/>
               </w:rPr>
-              <w:t>Vibrant Olive Palm Green line art &amp; dividers</w:t>
+              <w:t>Vibrant Olive Palm Green line art &amp; container dividers</w:t>
             </w:r>
           </w:p>
         </w:tc>
@@ -385,6 +411,7 @@
             <w:r>
               <w:rPr>
                 <w:rFonts w:ascii="Arial" w:hAnsi="Arial"/>
+                <w:sz w:val="19"/>
               </w:rPr>
               <w:t>Dark Inset Card</w:t>
             </w:r>
@@ -400,6 +427,7 @@
               <w:rPr>
                 <w:rFonts w:ascii="Consolas" w:hAnsi="Consolas"/>
                 <w:b/>
+                <w:sz w:val="19"/>
               </w:rPr>
               <w:t>#042616</w:t>
             </w:r>
@@ -414,13 +442,58 @@
             <w:r>
               <w:rPr>
                 <w:rFonts w:ascii="Arial" w:hAnsi="Arial"/>
+                <w:sz w:val="19"/>
               </w:rPr>
-              <w:t>Charcoal Forest Dark Green glassmorphic panels</w:t>
+              <w:t>Charcoal Forest Dark Green glassmorphism panels &amp; cards</w:t>
             </w:r>
           </w:p>
         </w:tc>
       </w:tr>
     </w:tbl>
+    <w:p/>
+    <w:p>
+      <w:pPr>
+        <w:pStyle w:val="Heading2"/>
+      </w:pPr>
+      <w:r>
+        <w:rPr>
+          <w:color w:val="148048"/>
+        </w:rPr>
+        <w:t>Typography Guidelines</w:t>
+      </w:r>
+    </w:p>
+    <w:p>
+      <w:pPr>
+        <w:pStyle w:val="ListBullet"/>
+      </w:pPr>
+      <w:r>
+        <w:t>• Display Headings: Ultra-bold condensed serif (Cinzel Decorative, Playfair Display) in Electric Yellow (#FFE500).</w:t>
+      </w:r>
+    </w:p>
+    <w:p>
+      <w:pPr>
+        <w:pStyle w:val="ListBullet"/>
+      </w:pPr>
+      <w:r>
+        <w:t>• Cultural Accents: Devanagari script badge ("गोवा") with neon pink glow (#FF007A).</w:t>
+      </w:r>
+    </w:p>
+    <w:p>
+      <w:pPr>
+        <w:pStyle w:val="ListBullet"/>
+      </w:pPr>
+      <w:r>
+        <w:t>• Technical Metadata: Uppercase Monospace font (JetBrains Mono, Space Mono).</w:t>
+      </w:r>
+    </w:p>
+    <w:p>
+      <w:pPr>
+        <w:pStyle w:val="ListBullet"/>
+      </w:pPr>
+      <w:r>
+        <w:t>• Controls &amp; Body: High-legibility Sans-Serif (Plus Jakarta Sans, Inter).</w:t>
+      </w:r>
+    </w:p>
     <w:p/>
     <w:p>
       <w:pPr>
@@ -449,7 +522,7 @@
         <w:pStyle w:val="ListBullet"/>
       </w:pPr>
       <w:r>
-        <w:t>• Format A (Official PVC ID Badge): 1080×1350 High-Resolution 4:5 vertical PVC badge with woven fabric lanyard, barcode, security hologram, personal details, category badge, and photo frame.</w:t>
+        <w:t>• Format A (Official PVC ID Badge): 1080×1350 High-Resolution 4:5 vertical PVC badge with woven fabric lanyard, barcode, security hologram, personal details, category badge (HACKER, BUILDER, SPEAKER, VIP, SPONSOR), and custom user photo frame.</w:t>
       </w:r>
     </w:p>
     <w:p>
@@ -465,7 +538,7 @@
         <w:pStyle w:val="ListBullet"/>
       </w:pPr>
       <w:r>
-        <w:t>• Dynamic Text Scaling: Measures text metrics dynamically to prevent overflow.</w:t>
+        <w:t>• Dynamic Text Scaling: Measures text metrics dynamically to prevent text overflow for long names or titles.</w:t>
       </w:r>
     </w:p>
     <w:p>
@@ -473,7 +546,7 @@
         <w:pStyle w:val="ListBullet"/>
       </w:pPr>
       <w:r>
-        <w:t>• Sticker Overlays: Position presets (topLeft, topRight, center, bottomLeft, bottomRight).</w:t>
+        <w:t>• Sticker Overlays: Interactive stickers with position presets (topLeft, topRight, center, bottomLeft, bottomRight).</w:t>
       </w:r>
     </w:p>
     <w:p>
@@ -481,7 +554,7 @@
         <w:pStyle w:val="ListBullet"/>
       </w:pPr>
       <w:r>
-        <w:t>• Dynamic QR Link: Generates custom QR code directly onto the badge.</w:t>
+        <w:t>• Dynamic QR Link: Dynamically encodes custom links (qrLink) directly onto the badge.</w:t>
       </w:r>
     </w:p>
     <w:p>
@@ -500,7 +573,7 @@
         <w:pStyle w:val="ListBullet"/>
       </w:pPr>
       <w:r>
-        <w:t>• Client-Side Compression: Resizes and downscales images under 1 second.</w:t>
+        <w:t>• Client-Side Compression (lib/image-compressor.ts): Automatically resizes and compresses user uploads under 1 second without server delays.</w:t>
       </w:r>
     </w:p>
     <w:p>
@@ -508,7 +581,7 @@
         <w:pStyle w:val="ListBullet"/>
       </w:pPr>
       <w:r>
-        <w:t>• Live Selfie Camera: WebCam capture with front/rear camera switching.</w:t>
+        <w:t>• Live Selfie Camera (CameraModal.tsx): Accesses webcam via navigator.mediaDevices.getUserMedia with front/rear camera switching and mirror mode.</w:t>
       </w:r>
     </w:p>
     <w:p>
@@ -516,7 +589,7 @@
         <w:pStyle w:val="ListBullet"/>
       </w:pPr>
       <w:r>
-        <w:t>• Interactive Drag &amp; Pinch-to-Zoom: Smooth mouse drag and touch gestures for aligning photos.</w:t>
+        <w:t>• Interactive Drag &amp; Pinch-to-Zoom: Mouse drag and touch pinch-to-zoom inside the preview canvas (CanvasPreview.tsx) to align photos perfectly.</w:t>
       </w:r>
     </w:p>
     <w:p>
@@ -535,7 +608,7 @@
         <w:pStyle w:val="ListBullet"/>
       </w:pPr>
       <w:r>
-        <w:t>• Real-Time WebGL 3D Badge: Three.js rendering with plastic specular reflections, metallic clasps, double-sided textures, and woven fabric lanyard.</w:t>
+        <w:t>• Real-Time 3D WebGL Inspection: Built with Three.js featuring double-sided texturing (Front 2D canvas texture + Back security card texture with barcode &amp; palm graphics). Realistic PVC plastic material with clearcoat specular reflection, metallic silver lanyard clasp, and woven fabric HHGOA lanyard strap.</w:t>
       </w:r>
     </w:p>
     <w:p>
@@ -543,7 +616,7 @@
         <w:pStyle w:val="ListBullet"/>
       </w:pPr>
       <w:r>
-        <w:t>• 6-Second 360° HD Video Export: Uses MediaRecorder API (video/webm) to render a 9:16 vertical Reel clip (540x960 at 30 fps) and auto-downloads the file.</w:t>
+        <w:t>• 6-Second 360° HD Video Export Engine: Captures a 9:16 vertical Reel video stream (540x960 resolution at 30 fps) using HTML5 MediaRecorder API (video/webm;codecs=vp9), animates a smooth 360° spin over 6.0 seconds, and automatically downloads ${Name}_3D_Spin_9x16.webm.</w:t>
       </w:r>
     </w:p>
     <w:p>
@@ -562,7 +635,7 @@
         <w:pStyle w:val="ListBullet"/>
       </w:pPr>
       <w:r>
-        <w:t>• PNG Download: Full 1080x1350 transparent high-res PNG format.</w:t>
+        <w:t>• PNG Image (.png): Full 1080x1350 high-resolution transparent PNG format.</w:t>
       </w:r>
     </w:p>
     <w:p>
@@ -570,7 +643,7 @@
         <w:pStyle w:val="ListBullet"/>
       </w:pPr>
       <w:r>
-        <w:t>• JPG Download: High-quality JPEG with solid emerald background.</w:t>
+        <w:t>• JPG Image (.jpg): High-quality compressed JPEG file with solid emerald background.</w:t>
       </w:r>
     </w:p>
     <w:p>
@@ -578,7 +651,7 @@
         <w:pStyle w:val="ListBullet"/>
       </w:pPr>
       <w:r>
-        <w:t>• 3D Video Export: 1-click auto-record &amp; download of 6-second 3D spin video clip.</w:t>
+        <w:t>• 3D Spin Video (.webm): 1-click auto-record &amp; download of 6-second 3D spin video clip.</w:t>
       </w:r>
     </w:p>
     <w:p>
@@ -586,7 +659,7 @@
         <w:pStyle w:val="ListBullet"/>
       </w:pPr>
       <w:r>
-        <w:t>• Split Dropdown Selector: Clean upward-opening menu with short titles &amp; subtexts.</w:t>
+        <w:t>• Unified Split Dropdown Selector: Single main button with upward-opening dropdown menu (bottom-full mb-2 z-50) featuring short titles &amp; concise subtexts (HD 1080p · Transparent, Compressed · Quick Share, 6s 360° HD Video Clip) to prevent mobile popup clipping.</w:t>
       </w:r>
     </w:p>
     <w:p>
@@ -594,7 +667,312 @@
         <w:pStyle w:val="ListBullet"/>
       </w:pPr>
       <w:r>
-        <w:t>• Direct Social Share: X (Twitter) &amp; LinkedIn native intents with pre-filled hashtags (#FrameInGoa, #HHGOA2026).</w:t>
+        <w:t>• Direct Social Share: X (Twitter) &amp; LinkedIn native Web Share API with fallback intent URLs and pre-filled hashtags (#FrameInGoa, #HHGOA2026).</w:t>
+      </w:r>
+    </w:p>
+    <w:p>
+      <w:pPr>
+        <w:pStyle w:val="ListBullet"/>
+      </w:pPr>
+      <w:r>
+        <w:t>• Celebratory Effects: Fires particle confetti (canvas-confetti) upon successful PNG/JPG export.</w:t>
+      </w:r>
+    </w:p>
+    <w:p>
+      <w:pPr>
+        <w:pStyle w:val="Heading2"/>
+      </w:pPr>
+      <w:r>
+        <w:rPr>
+          <w:color w:val="148048"/>
+        </w:rPr>
+        <w:t>📱 5. Mobile Responsiveness &amp; Layout Architecture</w:t>
+      </w:r>
+    </w:p>
+    <w:p>
+      <w:pPr>
+        <w:pStyle w:val="ListBullet"/>
+      </w:pPr>
+      <w:r>
+        <w:t>• Responsive 2×2 Control Grid: 3D Viewer bottom toolbar adapts into a clean 2×2 grid on mobile screens (&lt;640px) and expands into a single row on desktop.</w:t>
+      </w:r>
+    </w:p>
+    <w:p>
+      <w:pPr>
+        <w:pStyle w:val="ListBullet"/>
+      </w:pPr>
+      <w:r>
+        <w:t>• Adaptive Canvas Height: Viewport height scales automatically (h-[58vh] on mobile to h-[70vh] on desktop) to ensure bottom controls are never cut off.</w:t>
+      </w:r>
+    </w:p>
+    <w:p>
+      <w:pPr>
+        <w:pStyle w:val="ListBullet"/>
+      </w:pPr>
+      <w:r>
+        <w:t>• Touch Gestures: Single-finger drag to rotate 3D badge or pan photo, two-finger pinch to zoom photo.</w:t>
+      </w:r>
+    </w:p>
+    <w:p>
+      <w:pPr>
+        <w:pStyle w:val="Heading2"/>
+      </w:pPr>
+      <w:r>
+        <w:rPr>
+          <w:color w:val="148048"/>
+        </w:rPr>
+        <w:t>🛵 6. Tropical Visual Micro-Animations</w:t>
+      </w:r>
+    </w:p>
+    <w:p>
+      <w:pPr>
+        <w:pStyle w:val="ListBullet"/>
+      </w:pPr>
+      <w:r>
+        <w:t>• Moving Goa Scooty (MovingGoaScooty.tsx): Animated two-person scooty riding left-to-right across the bottom of the screen.</w:t>
+      </w:r>
+    </w:p>
+    <w:p>
+      <w:pPr>
+        <w:pStyle w:val="ListBullet"/>
+      </w:pPr>
+      <w:r>
+        <w:t>• Floating Particles (FloatingParticles.tsx): Ambient tropical emojis (🌴 🥥 🕶️ 🍹 🌊 🐚) floating smoothly in background.</w:t>
+      </w:r>
+    </w:p>
+    <w:p>
+      <w:pPr>
+        <w:pStyle w:val="ListBullet"/>
+      </w:pPr>
+      <w:r>
+        <w:t>• Devanagari Script Badge: Glowing animated motion badge ("गोवा") in header.</w:t>
+      </w:r>
+    </w:p>
+    <w:p/>
+    <w:p>
+      <w:pPr>
+        <w:pStyle w:val="Heading1"/>
+      </w:pPr>
+      <w:r>
+        <w:rPr>
+          <w:color w:val="0A5C36"/>
+        </w:rPr>
+        <w:t>4. Component Architecture Map &amp; Mermaid Flowchart</w:t>
+      </w:r>
+    </w:p>
+    <w:p>
+      <w:pPr>
+        <w:pStyle w:val="ListBullet"/>
+      </w:pPr>
+      <w:r>
+        <w:t>• app/page.tsx: Main entry page handling global generator state, personalized configuration, and layout grid.</w:t>
+      </w:r>
+    </w:p>
+    <w:p>
+      <w:pPr>
+        <w:pStyle w:val="ListBullet"/>
+      </w:pPr>
+      <w:r>
+        <w:t>• components/Header.tsx: Navigation header with Goa brand branding.</w:t>
+      </w:r>
+    </w:p>
+    <w:p>
+      <w:pPr>
+        <w:pStyle w:val="ListBullet"/>
+      </w:pPr>
+      <w:r>
+        <w:t>• components/FormatTabs.tsx: Format selector tabs (Format A / Format B).</w:t>
+      </w:r>
+    </w:p>
+    <w:p>
+      <w:pPr>
+        <w:pStyle w:val="ListBullet"/>
+      </w:pPr>
+      <w:r>
+        <w:t>• components/CanvasPreview.tsx: Main 2D preview canvas with drag &amp; pinch-to-zoom support, camera modal, 3D modal, and imperative ref handle.</w:t>
+      </w:r>
+    </w:p>
+    <w:p>
+      <w:pPr>
+        <w:pStyle w:val="ListBullet"/>
+      </w:pPr>
+      <w:r>
+        <w:t>• components/ControlsForm.tsx: Customization form for name, role, builder title, superpower, style preset, category, stickers, and QR link.</w:t>
+      </w:r>
+    </w:p>
+    <w:p>
+      <w:pPr>
+        <w:pStyle w:val="ListBullet"/>
+      </w:pPr>
+      <w:r>
+        <w:t>• components/ExportBar.tsx: Multi-format download &amp; social share toolbar with upward dropdown selector.</w:t>
+      </w:r>
+    </w:p>
+    <w:p>
+      <w:pPr>
+        <w:pStyle w:val="ListBullet"/>
+      </w:pPr>
+      <w:r>
+        <w:t>• components/Card3DViewer.tsx: WebGL 3D Badge Renderer &amp; 6-Second Video Export engine.</w:t>
+      </w:r>
+    </w:p>
+    <w:p>
+      <w:pPr>
+        <w:pStyle w:val="ListBullet"/>
+      </w:pPr>
+      <w:r>
+        <w:t>• components/CameraModal.tsx: Live camera snapshot modal.</w:t>
+      </w:r>
+    </w:p>
+    <w:p>
+      <w:pPr>
+        <w:pStyle w:val="ListBullet"/>
+      </w:pPr>
+      <w:r>
+        <w:t>• components/MovingGoaScooty.tsx: Animated scooty footer decoration.</w:t>
+      </w:r>
+    </w:p>
+    <w:p>
+      <w:pPr>
+        <w:pStyle w:val="ListBullet"/>
+      </w:pPr>
+      <w:r>
+        <w:t>• components/FloatingParticles.tsx: Ambient tropical particle animations.</w:t>
+      </w:r>
+    </w:p>
+    <w:p>
+      <w:pPr>
+        <w:pStyle w:val="Heading2"/>
+      </w:pPr>
+      <w:r>
+        <w:rPr>
+          <w:color w:val="148048"/>
+        </w:rPr>
+        <w:t>Mermaid Component Flowchart Diagram</w:t>
+      </w:r>
+    </w:p>
+    <w:tbl>
+      <w:tblPr>
+        <w:tblW w:type="auto" w:w="0"/>
+        <w:jc w:val="center"/>
+        <w:tblLook w:firstColumn="1" w:firstRow="1" w:lastColumn="0" w:lastRow="0" w:noHBand="0" w:noVBand="1" w:val="04A0"/>
+      </w:tblPr>
+      <w:tblGrid>
+        <w:gridCol w:w="9360"/>
+      </w:tblGrid>
+      <w:tr>
+        <w:tc>
+          <w:tcPr>
+            <w:tcW w:type="dxa" w:w="9360"/>
+            <w:shd w:val="clear" w:color="auto" w:fill="042616"/>
+          </w:tcPr>
+          <w:p>
+            <w:r>
+              <w:rPr>
+                <w:rFonts w:ascii="Consolas" w:hAnsi="Consolas"/>
+                <w:color w:val="FFE500"/>
+                <w:sz w:val="19"/>
+              </w:rPr>
+              <w:t>```mermaid</w:t>
+              <w:br/>
+              <w:t>graph TD</w:t>
+              <w:br/>
+              <w:t xml:space="preserve">  App[app/page.tsx - Main Page] --&gt; Header[components/Header.tsx]</w:t>
+              <w:br/>
+              <w:t xml:space="preserve">  App --&gt; FormatTabs[components/FormatTabs.tsx]</w:t>
+              <w:br/>
+              <w:t xml:space="preserve">  App --&gt; WorkspaceGrid[Main Workspace Grid]</w:t>
+              <w:br/>
+              <w:t xml:space="preserve">  </w:t>
+              <w:br/>
+              <w:t xml:space="preserve">  WorkspaceGrid --&gt; CanvasPreview[components/CanvasPreview.tsx]</w:t>
+              <w:br/>
+              <w:t xml:space="preserve">  WorkspaceGrid --&gt; ControlsForm[components/ControlsForm.tsx]</w:t>
+              <w:br/>
+              <w:t xml:space="preserve">  WorkspaceGrid --&gt; ExportBar[components/ExportBar.tsx]</w:t>
+              <w:br/>
+              <w:t xml:space="preserve">  </w:t>
+              <w:br/>
+              <w:t xml:space="preserve">  CanvasPreview --&gt; CameraModal[components/CameraModal.tsx]</w:t>
+              <w:br/>
+              <w:t xml:space="preserve">  CanvasPreview --&gt; Card3DViewer[components/Card3DViewer.tsx]</w:t>
+              <w:br/>
+              <w:t xml:space="preserve">  </w:t>
+              <w:br/>
+              <w:t xml:space="preserve">  CanvasPreview --&gt; CanvasGen[lib/canvas-generator.ts]</w:t>
+              <w:br/>
+              <w:t xml:space="preserve">  CameraModal --&gt; ImageComp[lib/image-compressor.ts]</w:t>
+              <w:br/>
+              <w:t xml:space="preserve">  </w:t>
+              <w:br/>
+              <w:t xml:space="preserve">  App --&gt; MovingScooty[components/MovingGoaScooty.tsx]</w:t>
+              <w:br/>
+              <w:t xml:space="preserve">  App --&gt; FloatingVibes[components/FloatingParticles.tsx]</w:t>
+              <w:br/>
+              <w:t>```</w:t>
+            </w:r>
+          </w:p>
+        </w:tc>
+      </w:tr>
+    </w:tbl>
+    <w:p/>
+    <w:p>
+      <w:pPr>
+        <w:pStyle w:val="Heading1"/>
+      </w:pPr>
+      <w:r>
+        <w:rPr>
+          <w:color w:val="0A5C36"/>
+        </w:rPr>
+        <w:t>5. Technical Stack Summary</w:t>
+      </w:r>
+    </w:p>
+    <w:p>
+      <w:pPr>
+        <w:pStyle w:val="ListBullet"/>
+      </w:pPr>
+      <w:r>
+        <w:t>• Framework: Next.js 14+ / React (TypeScript)</w:t>
+      </w:r>
+    </w:p>
+    <w:p>
+      <w:pPr>
+        <w:pStyle w:val="ListBullet"/>
+      </w:pPr>
+      <w:r>
+        <w:t>• Styling: Tailwind CSS + Custom CSS Variables &amp; Animations</w:t>
+      </w:r>
+    </w:p>
+    <w:p>
+      <w:pPr>
+        <w:pStyle w:val="ListBullet"/>
+      </w:pPr>
+      <w:r>
+        <w:t>• 3D Engine: Three.js WebGL Renderer</w:t>
+      </w:r>
+    </w:p>
+    <w:p>
+      <w:pPr>
+        <w:pStyle w:val="ListBullet"/>
+      </w:pPr>
+      <w:r>
+        <w:t>• Video Capture: WebRTC / HTML5 Canvas MediaRecorder API</w:t>
+      </w:r>
+    </w:p>
+    <w:p>
+      <w:pPr>
+        <w:pStyle w:val="ListBullet"/>
+      </w:pPr>
+      <w:r>
+        <w:t>• Icons: Lucide React</w:t>
+      </w:r>
+    </w:p>
+    <w:p>
+      <w:pPr>
+        <w:pStyle w:val="ListBullet"/>
+      </w:pPr>
+      <w:r>
+        <w:t>• Effects: Canvas Confetti</w:t>
       </w:r>
     </w:p>
     <w:sectPr>

</xml_diff>